<commit_message>
Hardware: TBD62083APG statt ULN2803A, Original-Projekt entfernt
ULN2803A ist abgekuendigt. Der TBD62083APG (DMOS) hat dieselbe Pinbelegung und passt in denselben Sockel, Leiterbahnen und Netze bleiben unveraendert. Schaltplan-Symbol, Bauteilwert, Bestueckungsdruck und Doku angepasst.

Co-Authored-By: Claude Opus 5.5 <noreply@anthropic.com>
Claude-Session: https://claude.ai/code/session_0118D4qppRkb6gR5m3R2CZyV
</commit_message>
<xml_diff>
--- a/docs/Hardware-Beschreibung_C3_S3.docx
+++ b/docs/Hardware-Beschreibung_C3_S3.docx
@@ -36,7 +36,7 @@
         <w:spacing w:after="120"/>
       </w:pPr>
       <w:r>
-        <w:t xml:space="preserve">Das RC-Multiswitch ist ein 8-kanaliges Schaltmodul für RC-Anwendungen (Licht, Zusatzfunktionen, Sound-Trigger). Die Kanäle werden über das CRSF-Protokoll (420 000 Baud) vom Empfänger angesteuert. Ein ULN2803A schaltet gegen Masse (Low-Side) Lasten mit 5–12 V; ein ESP32 übernimmt Protokoll, Logik und Konfiguration (WLAN-Web-UI, Lua-Script).</w:t>
+        <w:t>Das RC-Multiswitch ist ein 8-kanaliges Schaltmodul für RC-Anwendungen (Licht, Zusatzfunktionen, Sound-Trigger). Die Kanäle werden über das CRSF-Protokoll (420 000 Baud) vom Empfänger angesteuert. Ein TBD62083APG (Nachfolger des ULN2803A) schaltet gegen Masse (Low-Side) Lasten mit 5–12 V; ein ESP32 übernimmt Protokoll, Logik und Konfiguration (WLAN-Web-UI, Lua-Script).</w:t>
       </w:r>
     </w:p>
     <w:p>
@@ -767,7 +767,7 @@
         <w:t xml:space="preserve">Schaltstufe:</w:t>
       </w:r>
       <w:r>
-        <w:t xml:space="preserve"> ULN2803A (DIP-18, gesockelt), 8 Kanäle, Open-Collector gegen GND, max. 500 mA je Kanal (Datenblatt; Gesamtverlustleistung des Gehäuses beachten). Interne Freilaufdioden an COM → VLOAD.</w:t>
+        <w:t xml:space="preserve"> TBD62083APG (DIP-18, gesockelt; ein ULN2803A passt weiterhin, gleiche Pinbelegung), 8 Kanäle, Open-Drain gegen GND, max. 500 mA je Kanal, Summe ca. 1,5 A. Interne Freilaufdioden an COM → VLOAD.</w:t>
       </w:r>
     </w:p>
     <w:p>
@@ -783,7 +783,7 @@
           <w:b/>
           <w:bCs/>
         </w:rPr>
-        <w:t xml:space="preserve">Lastversorgung: CN2 (JST PH, 2-polig), 5–12 V, als VLOAD an COM des ULN und auf J1. TVS-Diode D1 P6KE18A schützt vor Spannungsspitzen.</w:t>
+        <w:t>Lastversorgung: CN2 (JST PH, 2-polig), 5–12 V, als VLOAD an COM des Treibers U2 und auf J1. TVS-Diode D1 P6KE18A schützt vor Spannungsspitzen.</w:t>
       </w:r>
       <w:r>
         <w:t xml:space="preserve"/>
@@ -1729,7 +1729,7 @@
                 <w:sz w:val="18"/>
                 <w:szCs w:val="18"/>
               </w:rPr>
-              <w:t xml:space="preserve">ULN-IN</w:t>
+              <w:t>U2-IN</w:t>
             </w:r>
           </w:p>
         </w:tc>
@@ -1758,7 +1758,7 @@
                 <w:sz w:val="18"/>
                 <w:szCs w:val="18"/>
               </w:rPr>
-              <w:t xml:space="preserve">ULN-OUT</w:t>
+              <w:t>U2-OUT</w:t>
             </w:r>
           </w:p>
         </w:tc>
@@ -4041,7 +4041,7 @@
                 <w:sz w:val="18"/>
                 <w:szCs w:val="18"/>
               </w:rPr>
-              <w:t xml:space="preserve">Schaltausgang (ULN-Eingang + LED) 1</w:t>
+              <w:t>Schaltausgang (Treiber-Eingang + LED) 1</w:t>
             </w:r>
           </w:p>
         </w:tc>
@@ -4150,7 +4150,7 @@
                 <w:sz w:val="18"/>
                 <w:szCs w:val="18"/>
               </w:rPr>
-              <w:t xml:space="preserve">Schaltausgang (ULN-Eingang + LED) 2</w:t>
+              <w:t>Schaltausgang (Treiber-Eingang + LED) 2</w:t>
             </w:r>
           </w:p>
         </w:tc>
@@ -4259,7 +4259,7 @@
                 <w:sz w:val="18"/>
                 <w:szCs w:val="18"/>
               </w:rPr>
-              <w:t xml:space="preserve">Schaltausgang (ULN-Eingang + LED) 3</w:t>
+              <w:t>Schaltausgang (Treiber-Eingang + LED) 3</w:t>
             </w:r>
           </w:p>
         </w:tc>
@@ -4368,7 +4368,7 @@
                 <w:sz w:val="18"/>
                 <w:szCs w:val="18"/>
               </w:rPr>
-              <w:t xml:space="preserve">Schaltausgang (ULN-Eingang + LED) 4</w:t>
+              <w:t>Schaltausgang (Treiber-Eingang + LED) 4</w:t>
             </w:r>
           </w:p>
         </w:tc>
@@ -4477,7 +4477,7 @@
                 <w:sz w:val="18"/>
                 <w:szCs w:val="18"/>
               </w:rPr>
-              <w:t xml:space="preserve">Schaltausgang (ULN-Eingang + LED) 5</w:t>
+              <w:t>Schaltausgang (Treiber-Eingang + LED) 5</w:t>
             </w:r>
           </w:p>
         </w:tc>
@@ -4586,7 +4586,7 @@
                 <w:sz w:val="18"/>
                 <w:szCs w:val="18"/>
               </w:rPr>
-              <w:t xml:space="preserve">Schaltausgang (ULN-Eingang + LED) 6</w:t>
+              <w:t>Schaltausgang (Treiber-Eingang + LED) 6</w:t>
             </w:r>
           </w:p>
         </w:tc>
@@ -4695,7 +4695,7 @@
                 <w:sz w:val="18"/>
                 <w:szCs w:val="18"/>
               </w:rPr>
-              <w:t xml:space="preserve">Schaltausgang (ULN-Eingang + LED) 7</w:t>
+              <w:t>Schaltausgang (Treiber-Eingang + LED) 7</w:t>
             </w:r>
           </w:p>
         </w:tc>
@@ -4804,7 +4804,7 @@
                 <w:sz w:val="18"/>
                 <w:szCs w:val="18"/>
               </w:rPr>
-              <w:t xml:space="preserve">Schaltausgang (ULN-Eingang + LED) 8</w:t>
+              <w:t>Schaltausgang (Treiber-Eingang + LED) 8</w:t>
             </w:r>
           </w:p>
         </w:tc>
@@ -6354,7 +6354,7 @@
                 <w:sz w:val="18"/>
                 <w:szCs w:val="18"/>
               </w:rPr>
-              <w:t xml:space="preserve">ULN2803A</w:t>
+              <w:t>TBD62083APG</w:t>
             </w:r>
           </w:p>
         </w:tc>
@@ -6472,7 +6472,7 @@
         <w:t xml:space="preserve">Strapping-Pins:</w:t>
       </w:r>
       <w:r>
-        <w:t xml:space="preserve"> IO2 (Kanal 3), IO8 (UB_RX), IO9 (BOOT). Beim Reset sollten IO8 und IO9 high sein; IO2-Beschaltung (LED + ULN-Eingang nach GND) beim ersten Test prüfen.</w:t>
+        <w:t xml:space="preserve"> IO2 (Kanal 3), IO8 (UB_RX), IO9 (BOOT). Beim Reset sollten IO8 und IO9 high sein; IO2-Beschaltung (LED + Treiber-Eingang nach GND) beim ersten Test prüfen.</w:t>
       </w:r>
     </w:p>
     <w:p>
@@ -6759,7 +6759,7 @@
                 <w:sz w:val="18"/>
                 <w:szCs w:val="18"/>
               </w:rPr>
-              <w:t xml:space="preserve">Schaltausgang (ULN-Eingang + LED) 1</w:t>
+              <w:t>Schaltausgang (Treiber-Eingang + LED) 1</w:t>
             </w:r>
           </w:p>
         </w:tc>
@@ -6868,7 +6868,7 @@
                 <w:sz w:val="18"/>
                 <w:szCs w:val="18"/>
               </w:rPr>
-              <w:t xml:space="preserve">Schaltausgang (ULN-Eingang + LED) 2</w:t>
+              <w:t>Schaltausgang (Treiber-Eingang + LED) 2</w:t>
             </w:r>
           </w:p>
         </w:tc>
@@ -6977,7 +6977,7 @@
                 <w:sz w:val="18"/>
                 <w:szCs w:val="18"/>
               </w:rPr>
-              <w:t xml:space="preserve">Schaltausgang (ULN-Eingang + LED) 3</w:t>
+              <w:t>Schaltausgang (Treiber-Eingang + LED) 3</w:t>
             </w:r>
           </w:p>
         </w:tc>
@@ -7086,7 +7086,7 @@
                 <w:sz w:val="18"/>
                 <w:szCs w:val="18"/>
               </w:rPr>
-              <w:t xml:space="preserve">Schaltausgang (ULN-Eingang + LED) 4</w:t>
+              <w:t>Schaltausgang (Treiber-Eingang + LED) 4</w:t>
             </w:r>
           </w:p>
         </w:tc>
@@ -7195,7 +7195,7 @@
                 <w:sz w:val="18"/>
                 <w:szCs w:val="18"/>
               </w:rPr>
-              <w:t xml:space="preserve">Schaltausgang (ULN-Eingang + LED) 5</w:t>
+              <w:t>Schaltausgang (Treiber-Eingang + LED) 5</w:t>
             </w:r>
           </w:p>
         </w:tc>
@@ -7304,7 +7304,7 @@
                 <w:sz w:val="18"/>
                 <w:szCs w:val="18"/>
               </w:rPr>
-              <w:t xml:space="preserve">Schaltausgang (ULN-Eingang + LED) 6</w:t>
+              <w:t>Schaltausgang (Treiber-Eingang + LED) 6</w:t>
             </w:r>
           </w:p>
         </w:tc>
@@ -7413,7 +7413,7 @@
                 <w:sz w:val="18"/>
                 <w:szCs w:val="18"/>
               </w:rPr>
-              <w:t xml:space="preserve">Schaltausgang (ULN-Eingang + LED) 7</w:t>
+              <w:t>Schaltausgang (Treiber-Eingang + LED) 7</w:t>
             </w:r>
           </w:p>
         </w:tc>
@@ -7522,7 +7522,7 @@
                 <w:sz w:val="18"/>
                 <w:szCs w:val="18"/>
               </w:rPr>
-              <w:t xml:space="preserve">Schaltausgang (ULN-Eingang + LED) 8</w:t>
+              <w:t>Schaltausgang (Treiber-Eingang + LED) 8</w:t>
             </w:r>
           </w:p>
         </w:tc>
@@ -9399,7 +9399,7 @@
                 <w:sz w:val="18"/>
                 <w:szCs w:val="18"/>
               </w:rPr>
-              <w:t xml:space="preserve">ULN2803A</w:t>
+              <w:t>TBD62083APG</w:t>
             </w:r>
           </w:p>
         </w:tc>
@@ -9564,7 +9564,7 @@
         </w:numPr>
       </w:pPr>
       <w:r>
-        <w:t xml:space="preserve">Schaltstrom: max. 500 mA je Kanal, Summenstrom durch ULN2803A-Verlustleistung begrenzt (VCE(sat) ≈ 1,1…1,3 V bei 350 mA → ca. 0,4 W je Kanal bei dieser Last). Bei mehreren Kanälen mit hoher Last Kühlung/Derating prüfen.</w:t>
+        <w:t>Schaltstrom: max. 500 mA je Kanal, Summe aller Kanäle ca. 1,5 A. Der TBD62083APG verliert nur ca. 0,2–0,4 V; beim ULN2803A sind es ca. 1,1–1,3 V bei 350 mA (ca. 0,4 W je Kanal), dann bei mehreren Kanälen mit hoher Last Derating prüfen.</w:t>
       </w:r>
     </w:p>
     <w:p>

</xml_diff>